<commit_message>
added report generation for vehicle inv
</commit_message>
<xml_diff>
--- a/report_template/gas&rfid_temp.docx
+++ b/report_template/gas&rfid_temp.docx
@@ -5,6 +5,7 @@
     <w:p>
       <w:pPr>
         <w:rPr>
+          <w:rFonts w:ascii="Arial" w:hAnsi="Arial" w:cs="Arial"/>
           <w:b/>
           <w:bCs/>
         </w:rPr>
@@ -13,6 +14,7 @@
     <w:p>
       <w:pPr>
         <w:rPr>
+          <w:rFonts w:ascii="Arial" w:hAnsi="Arial" w:cs="Arial"/>
           <w:b/>
           <w:bCs/>
           <w:u w:val="single"/>
@@ -20,6 +22,7 @@
       </w:pPr>
       <w:r>
         <w:rPr>
+          <w:rFonts w:ascii="Arial" w:hAnsi="Arial" w:cs="Arial"/>
           <w:b/>
           <w:bCs/>
         </w:rPr>
@@ -27,6 +30,7 @@
       </w:r>
       <w:r>
         <w:rPr>
+          <w:rFonts w:ascii="Arial" w:hAnsi="Arial" w:cs="Arial"/>
           <w:b/>
           <w:bCs/>
           <w:u w:val="single"/>
@@ -36,6 +40,7 @@
       <w:proofErr w:type="spellStart"/>
       <w:r>
         <w:rPr>
+          <w:rFonts w:ascii="Arial" w:hAnsi="Arial" w:cs="Arial"/>
           <w:b/>
           <w:bCs/>
           <w:u w:val="single"/>
@@ -45,6 +50,7 @@
       <w:proofErr w:type="spellEnd"/>
       <w:r>
         <w:rPr>
+          <w:rFonts w:ascii="Arial" w:hAnsi="Arial" w:cs="Arial"/>
           <w:b/>
           <w:bCs/>
           <w:u w:val="single"/>
@@ -52,7 +58,13 @@
         <w:t>}}</w:t>
       </w:r>
     </w:p>
-    <w:p/>
+    <w:p>
+      <w:pPr>
+        <w:rPr>
+          <w:rFonts w:ascii="Arial" w:hAnsi="Arial" w:cs="Arial"/>
+        </w:rPr>
+      </w:pPr>
+    </w:p>
     <w:tbl>
       <w:tblPr>
         <w:tblStyle w:val="a"/>
@@ -100,8 +112,14 @@
               <w:widowControl w:val="0"/>
               <w:spacing w:after="0" w:line="240" w:lineRule="auto"/>
               <w:jc w:val="center"/>
+              <w:rPr>
+                <w:rFonts w:ascii="Arial" w:hAnsi="Arial" w:cs="Arial"/>
+              </w:rPr>
             </w:pPr>
             <w:r>
+              <w:rPr>
+                <w:rFonts w:ascii="Arial" w:hAnsi="Arial" w:cs="Arial"/>
+              </w:rPr>
               <w:t>Date</w:t>
             </w:r>
           </w:p>
@@ -115,8 +133,14 @@
               <w:widowControl w:val="0"/>
               <w:spacing w:after="0" w:line="240" w:lineRule="auto"/>
               <w:jc w:val="center"/>
+              <w:rPr>
+                <w:rFonts w:ascii="Arial" w:hAnsi="Arial" w:cs="Arial"/>
+              </w:rPr>
             </w:pPr>
             <w:r>
+              <w:rPr>
+                <w:rFonts w:ascii="Arial" w:hAnsi="Arial" w:cs="Arial"/>
+              </w:rPr>
               <w:t>Vehicle Name</w:t>
             </w:r>
           </w:p>
@@ -136,8 +160,14 @@
               <w:widowControl w:val="0"/>
               <w:spacing w:after="0" w:line="240" w:lineRule="auto"/>
               <w:jc w:val="center"/>
+              <w:rPr>
+                <w:rFonts w:ascii="Arial" w:hAnsi="Arial" w:cs="Arial"/>
+              </w:rPr>
             </w:pPr>
             <w:r>
+              <w:rPr>
+                <w:rFonts w:ascii="Arial" w:hAnsi="Arial" w:cs="Arial"/>
+              </w:rPr>
               <w:t>Driver</w:t>
             </w:r>
           </w:p>
@@ -157,8 +187,14 @@
               <w:widowControl w:val="0"/>
               <w:spacing w:after="0" w:line="240" w:lineRule="auto"/>
               <w:jc w:val="center"/>
+              <w:rPr>
+                <w:rFonts w:ascii="Arial" w:hAnsi="Arial" w:cs="Arial"/>
+              </w:rPr>
             </w:pPr>
             <w:r>
+              <w:rPr>
+                <w:rFonts w:ascii="Arial" w:hAnsi="Arial" w:cs="Arial"/>
+              </w:rPr>
               <w:t>Gas Balance in Tank</w:t>
             </w:r>
           </w:p>
@@ -178,8 +214,14 @@
               <w:widowControl w:val="0"/>
               <w:spacing w:after="0" w:line="240" w:lineRule="auto"/>
               <w:jc w:val="center"/>
+              <w:rPr>
+                <w:rFonts w:ascii="Arial" w:hAnsi="Arial" w:cs="Arial"/>
+              </w:rPr>
             </w:pPr>
             <w:r>
+              <w:rPr>
+                <w:rFonts w:ascii="Arial" w:hAnsi="Arial" w:cs="Arial"/>
+              </w:rPr>
               <w:t>Purchased During Trip</w:t>
             </w:r>
           </w:p>
@@ -199,8 +241,14 @@
               <w:widowControl w:val="0"/>
               <w:spacing w:after="0" w:line="240" w:lineRule="auto"/>
               <w:jc w:val="center"/>
+              <w:rPr>
+                <w:rFonts w:ascii="Arial" w:hAnsi="Arial" w:cs="Arial"/>
+              </w:rPr>
             </w:pPr>
             <w:r>
+              <w:rPr>
+                <w:rFonts w:ascii="Arial" w:hAnsi="Arial" w:cs="Arial"/>
+              </w:rPr>
               <w:t>Balance After the Trip</w:t>
             </w:r>
           </w:p>
@@ -220,8 +268,14 @@
               <w:widowControl w:val="0"/>
               <w:spacing w:after="0" w:line="240" w:lineRule="auto"/>
               <w:jc w:val="center"/>
+              <w:rPr>
+                <w:rFonts w:ascii="Arial" w:hAnsi="Arial" w:cs="Arial"/>
+              </w:rPr>
             </w:pPr>
             <w:r>
+              <w:rPr>
+                <w:rFonts w:ascii="Arial" w:hAnsi="Arial" w:cs="Arial"/>
+              </w:rPr>
               <w:t>KM Beginning of the Trip</w:t>
             </w:r>
           </w:p>
@@ -241,8 +295,14 @@
               <w:widowControl w:val="0"/>
               <w:spacing w:after="0" w:line="240" w:lineRule="auto"/>
               <w:jc w:val="center"/>
+              <w:rPr>
+                <w:rFonts w:ascii="Arial" w:hAnsi="Arial" w:cs="Arial"/>
+              </w:rPr>
             </w:pPr>
             <w:r>
+              <w:rPr>
+                <w:rFonts w:ascii="Arial" w:hAnsi="Arial" w:cs="Arial"/>
+              </w:rPr>
               <w:t>KM End of the Trip</w:t>
             </w:r>
           </w:p>
@@ -262,8 +322,14 @@
               <w:widowControl w:val="0"/>
               <w:spacing w:after="0" w:line="240" w:lineRule="auto"/>
               <w:jc w:val="center"/>
+              <w:rPr>
+                <w:rFonts w:ascii="Arial" w:hAnsi="Arial" w:cs="Arial"/>
+              </w:rPr>
             </w:pPr>
             <w:r>
+              <w:rPr>
+                <w:rFonts w:ascii="Arial" w:hAnsi="Arial" w:cs="Arial"/>
+              </w:rPr>
               <w:t>KM Used During the Trip</w:t>
             </w:r>
           </w:p>
@@ -283,12 +349,21 @@
               <w:widowControl w:val="0"/>
               <w:spacing w:after="0" w:line="240" w:lineRule="auto"/>
               <w:jc w:val="center"/>
+              <w:rPr>
+                <w:rFonts w:ascii="Arial" w:hAnsi="Arial" w:cs="Arial"/>
+              </w:rPr>
             </w:pPr>
             <w:r>
+              <w:rPr>
+                <w:rFonts w:ascii="Arial" w:hAnsi="Arial" w:cs="Arial"/>
+              </w:rPr>
               <w:t xml:space="preserve">RFID Balance </w:t>
             </w:r>
             <w:proofErr w:type="spellStart"/>
             <w:r>
+              <w:rPr>
+                <w:rFonts w:ascii="Arial" w:hAnsi="Arial" w:cs="Arial"/>
+              </w:rPr>
               <w:t>Easytrip</w:t>
             </w:r>
             <w:proofErr w:type="spellEnd"/>
@@ -309,8 +384,14 @@
               <w:widowControl w:val="0"/>
               <w:spacing w:after="0" w:line="240" w:lineRule="auto"/>
               <w:jc w:val="center"/>
+              <w:rPr>
+                <w:rFonts w:ascii="Arial" w:hAnsi="Arial" w:cs="Arial"/>
+              </w:rPr>
             </w:pPr>
             <w:r>
+              <w:rPr>
+                <w:rFonts w:ascii="Arial" w:hAnsi="Arial" w:cs="Arial"/>
+              </w:rPr>
               <w:t>RFID Balance AutoSweep</w:t>
             </w:r>
           </w:p>
@@ -330,8 +411,14 @@
               <w:widowControl w:val="0"/>
               <w:spacing w:after="0" w:line="240" w:lineRule="auto"/>
               <w:jc w:val="center"/>
+              <w:rPr>
+                <w:rFonts w:ascii="Arial" w:hAnsi="Arial" w:cs="Arial"/>
+              </w:rPr>
             </w:pPr>
             <w:r>
+              <w:rPr>
+                <w:rFonts w:ascii="Arial" w:hAnsi="Arial" w:cs="Arial"/>
+              </w:rPr>
               <w:t>Remarks</w:t>
             </w:r>
           </w:p>
@@ -351,8 +438,14 @@
               <w:widowControl w:val="0"/>
               <w:spacing w:after="0" w:line="240" w:lineRule="auto"/>
               <w:jc w:val="center"/>
+              <w:rPr>
+                <w:rFonts w:ascii="Arial" w:hAnsi="Arial" w:cs="Arial"/>
+              </w:rPr>
             </w:pPr>
             <w:r>
+              <w:rPr>
+                <w:rFonts w:ascii="Arial" w:hAnsi="Arial" w:cs="Arial"/>
+              </w:rPr>
               <w:t>Signature</w:t>
             </w:r>
           </w:p>
@@ -362,6 +455,7 @@
     <w:p>
       <w:pPr>
         <w:rPr>
+          <w:rFonts w:ascii="Arial" w:hAnsi="Arial" w:cs="Arial"/>
           <w:b/>
           <w:bCs/>
           <w:u w:val="single"/>
@@ -371,6 +465,7 @@
     <w:p>
       <w:pPr>
         <w:rPr>
+          <w:rFonts w:ascii="Arial" w:hAnsi="Arial" w:cs="Arial"/>
           <w:b/>
           <w:bCs/>
           <w:u w:val="single"/>
@@ -528,13 +623,7 @@
         <w:rPr>
           <w:rFonts w:ascii="Arial" w:eastAsia="Arial" w:hAnsi="Arial" w:cs="Arial"/>
         </w:rPr>
-        <w:t>₱</w:t>
-      </w:r>
-      <w:r>
-        <w:rPr>
-          <w:rFonts w:ascii="Arial" w:eastAsia="Arial" w:hAnsi="Arial" w:cs="Arial"/>
-        </w:rPr>
-        <w:t>{{</w:t>
+        <w:t>₱{{</w:t>
       </w:r>
       <w:proofErr w:type="spellStart"/>
       <w:r>
@@ -581,19 +670,7 @@
         <w:rPr>
           <w:rFonts w:ascii="Arial" w:eastAsia="Arial" w:hAnsi="Arial" w:cs="Arial"/>
         </w:rPr>
-        <w:t xml:space="preserve">: </w:t>
-      </w:r>
-      <w:r>
-        <w:rPr>
-          <w:rFonts w:ascii="Arial" w:eastAsia="Arial" w:hAnsi="Arial" w:cs="Arial"/>
-        </w:rPr>
-        <w:t>₱</w:t>
-      </w:r>
-      <w:r>
-        <w:rPr>
-          <w:rFonts w:ascii="Arial" w:eastAsia="Arial" w:hAnsi="Arial" w:cs="Arial"/>
-        </w:rPr>
-        <w:t>{{</w:t>
+        <w:t>: ₱{{</w:t>
       </w:r>
       <w:proofErr w:type="spellStart"/>
       <w:r>
@@ -629,13 +706,22 @@
       </w:pPr>
     </w:p>
     <w:p>
-      <w:r>
+      <w:pPr>
+        <w:rPr>
+          <w:rFonts w:ascii="Arial" w:hAnsi="Arial" w:cs="Arial"/>
+        </w:rPr>
+      </w:pPr>
+      <w:r>
+        <w:rPr>
+          <w:rFonts w:ascii="Arial" w:hAnsi="Arial" w:cs="Arial"/>
+        </w:rPr>
         <w:t>Reviewed by:</w:t>
       </w:r>
     </w:p>
     <w:p>
       <w:pPr>
         <w:rPr>
+          <w:rFonts w:ascii="Arial" w:hAnsi="Arial" w:cs="Arial"/>
           <w:b/>
           <w:bCs/>
           <w:u w:val="single"/>
@@ -643,6 +729,7 @@
       </w:pPr>
       <w:r>
         <w:rPr>
+          <w:rFonts w:ascii="Arial" w:hAnsi="Arial" w:cs="Arial"/>
           <w:b/>
           <w:bCs/>
           <w:u w:val="single"/>
@@ -651,6 +738,7 @@
       </w:r>
       <w:r>
         <w:rPr>
+          <w:rFonts w:ascii="Arial" w:hAnsi="Arial" w:cs="Arial"/>
           <w:b/>
           <w:bCs/>
         </w:rPr>
@@ -658,6 +746,7 @@
       </w:r>
       <w:r>
         <w:rPr>
+          <w:rFonts w:ascii="Arial" w:hAnsi="Arial" w:cs="Arial"/>
           <w:b/>
           <w:bCs/>
         </w:rPr>
@@ -665,6 +754,7 @@
       </w:r>
       <w:r>
         <w:rPr>
+          <w:rFonts w:ascii="Arial" w:hAnsi="Arial" w:cs="Arial"/>
           <w:b/>
           <w:bCs/>
         </w:rPr>
@@ -672,6 +762,7 @@
       </w:r>
       <w:r>
         <w:rPr>
+          <w:rFonts w:ascii="Arial" w:hAnsi="Arial" w:cs="Arial"/>
           <w:b/>
           <w:bCs/>
         </w:rPr>
@@ -679,6 +770,7 @@
       </w:r>
       <w:r>
         <w:rPr>
+          <w:rFonts w:ascii="Arial" w:hAnsi="Arial" w:cs="Arial"/>
           <w:b/>
           <w:bCs/>
         </w:rPr>
@@ -686,6 +778,7 @@
       </w:r>
       <w:r>
         <w:rPr>
+          <w:rFonts w:ascii="Arial" w:hAnsi="Arial" w:cs="Arial"/>
           <w:b/>
           <w:bCs/>
         </w:rPr>
@@ -693,6 +786,7 @@
       </w:r>
       <w:r>
         <w:rPr>
+          <w:rFonts w:ascii="Arial" w:hAnsi="Arial" w:cs="Arial"/>
           <w:b/>
           <w:bCs/>
         </w:rPr>
@@ -700,6 +794,7 @@
       </w:r>
       <w:r>
         <w:rPr>
+          <w:rFonts w:ascii="Arial" w:hAnsi="Arial" w:cs="Arial"/>
           <w:b/>
           <w:bCs/>
         </w:rPr>
@@ -707,6 +802,7 @@
       </w:r>
       <w:r>
         <w:rPr>
+          <w:rFonts w:ascii="Arial" w:hAnsi="Arial" w:cs="Arial"/>
           <w:b/>
           <w:bCs/>
         </w:rPr>
@@ -714,6 +810,7 @@
       </w:r>
       <w:r>
         <w:rPr>
+          <w:rFonts w:ascii="Arial" w:hAnsi="Arial" w:cs="Arial"/>
           <w:b/>
           <w:bCs/>
         </w:rPr>
@@ -721,6 +818,7 @@
       </w:r>
       <w:r>
         <w:rPr>
+          <w:rFonts w:ascii="Arial" w:hAnsi="Arial" w:cs="Arial"/>
           <w:b/>
           <w:bCs/>
         </w:rPr>
@@ -728,6 +826,7 @@
       </w:r>
       <w:r>
         <w:rPr>
+          <w:rFonts w:ascii="Arial" w:hAnsi="Arial" w:cs="Arial"/>
           <w:b/>
           <w:bCs/>
         </w:rPr>
@@ -735,6 +834,7 @@
       </w:r>
       <w:r>
         <w:rPr>
+          <w:rFonts w:ascii="Arial" w:hAnsi="Arial" w:cs="Arial"/>
           <w:b/>
           <w:bCs/>
         </w:rPr>
@@ -743,6 +843,7 @@
       <w:proofErr w:type="spellStart"/>
       <w:r>
         <w:rPr>
+          <w:rFonts w:ascii="Arial" w:hAnsi="Arial" w:cs="Arial"/>
           <w:b/>
           <w:bCs/>
           <w:u w:val="single"/>
@@ -752,44 +853,88 @@
       <w:proofErr w:type="spellEnd"/>
     </w:p>
     <w:p>
-      <w:r>
+      <w:pPr>
+        <w:rPr>
+          <w:rFonts w:ascii="Arial" w:hAnsi="Arial" w:cs="Arial"/>
+        </w:rPr>
+      </w:pPr>
+      <w:r>
+        <w:rPr>
+          <w:rFonts w:ascii="Arial" w:hAnsi="Arial" w:cs="Arial"/>
+        </w:rPr>
         <w:lastRenderedPageBreak/>
         <w:t>Chief, TMPS</w:t>
       </w:r>
       <w:r>
+        <w:rPr>
+          <w:rFonts w:ascii="Arial" w:hAnsi="Arial" w:cs="Arial"/>
+        </w:rPr>
         <w:tab/>
       </w:r>
       <w:r>
+        <w:rPr>
+          <w:rFonts w:ascii="Arial" w:hAnsi="Arial" w:cs="Arial"/>
+        </w:rPr>
         <w:tab/>
       </w:r>
       <w:r>
+        <w:rPr>
+          <w:rFonts w:ascii="Arial" w:hAnsi="Arial" w:cs="Arial"/>
+        </w:rPr>
         <w:tab/>
       </w:r>
       <w:r>
+        <w:rPr>
+          <w:rFonts w:ascii="Arial" w:hAnsi="Arial" w:cs="Arial"/>
+        </w:rPr>
         <w:tab/>
       </w:r>
       <w:r>
+        <w:rPr>
+          <w:rFonts w:ascii="Arial" w:hAnsi="Arial" w:cs="Arial"/>
+        </w:rPr>
         <w:tab/>
       </w:r>
       <w:r>
+        <w:rPr>
+          <w:rFonts w:ascii="Arial" w:hAnsi="Arial" w:cs="Arial"/>
+        </w:rPr>
         <w:tab/>
       </w:r>
       <w:r>
+        <w:rPr>
+          <w:rFonts w:ascii="Arial" w:hAnsi="Arial" w:cs="Arial"/>
+        </w:rPr>
         <w:tab/>
       </w:r>
       <w:r>
+        <w:rPr>
+          <w:rFonts w:ascii="Arial" w:hAnsi="Arial" w:cs="Arial"/>
+        </w:rPr>
         <w:tab/>
       </w:r>
       <w:r>
+        <w:rPr>
+          <w:rFonts w:ascii="Arial" w:hAnsi="Arial" w:cs="Arial"/>
+        </w:rPr>
         <w:tab/>
       </w:r>
       <w:r>
+        <w:rPr>
+          <w:rFonts w:ascii="Arial" w:hAnsi="Arial" w:cs="Arial"/>
+        </w:rPr>
         <w:tab/>
       </w:r>
       <w:r>
+        <w:rPr>
+          <w:rFonts w:ascii="Arial" w:hAnsi="Arial" w:cs="Arial"/>
+        </w:rPr>
         <w:tab/>
       </w:r>
       <w:r>
+        <w:rPr>
+          <w:rFonts w:ascii="Arial" w:hAnsi="Arial" w:cs="Arial"/>
+        </w:rPr>
         <w:tab/>
         <w:t>Director, GASS</w:t>
       </w:r>

</xml_diff>